<commit_message>
Medicion de logros con indicadores de CRM y campanas
</commit_message>
<xml_diff>
--- a/Cotizaciones_y_Reportes/Medición de Logros y Resultados - Fase 2.docx
+++ b/Cotizaciones_y_Reportes/Medición de Logros y Resultados - Fase 2.docx
@@ -75,6 +75,15 @@
       <w:r>
         <w:rPr>
           <w:rFonts w:ascii="Times New Roman" w:hAnsi="Times New Roman" w:eastAsia="Times New Roman"/>
+          <w:sz w:val="24"/>
+        </w:rPr>
+        <w:t>• CRM y marketing: 5 oportunidades en el pipeline (Q 67,400.00 esperados) y 2 campañas de correo segmentadas con 7 envíos.</w:t>
+      </w:r>
+    </w:p>
+    <w:p>
+      <w:r>
+        <w:rPr>
+          <w:rFonts w:ascii="Times New Roman" w:hAnsi="Times New Roman" w:eastAsia="Times New Roman"/>
           <w:b/>
           <w:sz w:val="24"/>
         </w:rPr>
@@ -87,7 +96,7 @@
           <w:rFonts w:ascii="Times New Roman" w:hAnsi="Times New Roman" w:eastAsia="Times New Roman"/>
           <w:sz w:val="24"/>
         </w:rPr>
-        <w:t>Cada objetivo se mide contrastando la meta planteada con los registros del ERP. La puesta en marcha del catálogo se verifica con el número de productos activos con costo, precio, imagen y existencias (30 de 30). La operación comercial se mide con las cotizaciones emitidas y convertidas en pedido, y el abastecimiento con las órdenes de compra recibidas y las alertas de reposición atendidas.</w:t>
+        <w:t>Cada objetivo se mide contrastando la meta planteada con los registros del ERP. La puesta en marcha del catálogo se verifica con el número de productos activos con costo, precio, imagen y existencias (30 de 30). La operación comercial se mide con las cotizaciones emitidas y convertidas en pedido, el abastecimiento con las órdenes de compra recibidas y las alertas de reposición atendidas, y el marketing con la tasa de entrega de las campañas y el avance de las oportunidades en el pipeline.</w:t>
       </w:r>
     </w:p>
     <w:p>
@@ -106,7 +115,7 @@
           <w:rFonts w:ascii="Times New Roman" w:hAnsi="Times New Roman" w:eastAsia="Times New Roman"/>
           <w:sz w:val="24"/>
         </w:rPr>
-        <w:t>Se evalúa con el estado de cada documento dentro de su flujo. En compras: Requisición, Solicitud de presupuesto, Orden de compra y Recepción. En ventas: Presupuesto, Pedido de venta, Entrega y Factura. Cada cambio de estado queda registrado con fecha, hora y usuario en el historial del documento.</w:t>
+        <w:t>Se evalúa con el estado de cada documento dentro de su flujo. En compras: Requisición, Solicitud de presupuesto, Orden de compra y Recepción. En ventas: Presupuesto, Pedido de venta, Entrega y Factura. En CRM: Lead, Contactado, Negociación y Ganado/Perdido. En campañas: Borrador, En cola y Enviado. Cada cambio de estado queda registrado con fecha, hora y usuario en el historial del documento.</w:t>
       </w:r>
     </w:p>
     <w:p>
@@ -720,10 +729,9 @@
         </w:tblBorders>
       </w:tblPr>
       <w:tblGrid>
-        <w:gridCol w:w="2209"/>
-        <w:gridCol w:w="2209"/>
-        <w:gridCol w:w="2209"/>
-        <w:gridCol w:w="2209"/>
+        <w:gridCol w:w="2946"/>
+        <w:gridCol w:w="2946"/>
+        <w:gridCol w:w="2946"/>
       </w:tblGrid>
       <w:tr>
         <w:tc>
@@ -744,7 +752,7 @@
         </w:tc>
         <w:tc>
           <w:tcPr>
-            <w:tcW w:type="dxa" w:w="1587"/>
+            <w:tcW w:type="dxa" w:w="2608"/>
           </w:tcPr>
           <w:p>
             <w:r/>
@@ -754,29 +762,13 @@
                 <w:b/>
                 <w:sz w:val="20"/>
               </w:rPr>
-              <w:t>Responsable</w:t>
-            </w:r>
-          </w:p>
-        </w:tc>
-        <w:tc>
-          <w:tcPr>
-            <w:tcW w:type="dxa" w:w="3061"/>
-          </w:tcPr>
-          <w:p>
-            <w:r/>
-            <w:r>
-              <w:rPr>
-                <w:rFonts w:ascii="Times New Roman" w:hAnsi="Times New Roman" w:eastAsia="Times New Roman"/>
-                <w:b/>
-                <w:sz w:val="20"/>
-              </w:rPr>
-              <w:t>Transacciones</w:t>
-            </w:r>
-          </w:p>
-        </w:tc>
-        <w:tc>
-          <w:tcPr>
-            <w:tcW w:type="dxa" w:w="2268"/>
+              <w:t>Indicador</w:t>
+            </w:r>
+          </w:p>
+        </w:tc>
+        <w:tc>
+          <w:tcPr>
+            <w:tcW w:type="dxa" w:w="4309"/>
           </w:tcPr>
           <w:p>
             <w:r/>
@@ -809,46 +801,31 @@
         </w:tc>
         <w:tc>
           <w:tcPr>
-            <w:tcW w:type="dxa" w:w="1587"/>
-          </w:tcPr>
-          <w:p>
-            <w:r/>
-            <w:r>
-              <w:rPr>
-                <w:rFonts w:ascii="Times New Roman" w:hAnsi="Times New Roman" w:eastAsia="Times New Roman"/>
-                <w:sz w:val="20"/>
-              </w:rPr>
-              <w:t>Norma Canú</w:t>
-            </w:r>
-          </w:p>
-        </w:tc>
-        <w:tc>
-          <w:tcPr>
-            <w:tcW w:type="dxa" w:w="3061"/>
-          </w:tcPr>
-          <w:p>
-            <w:r/>
-            <w:r>
-              <w:rPr>
-                <w:rFonts w:ascii="Times New Roman" w:hAnsi="Times New Roman" w:eastAsia="Times New Roman"/>
-                <w:sz w:val="20"/>
-              </w:rPr>
-              <w:t>30 productos, 6 proveedores, 7 clientes</w:t>
-            </w:r>
-          </w:p>
-        </w:tc>
-        <w:tc>
-          <w:tcPr>
-            <w:tcW w:type="dxa" w:w="2268"/>
-          </w:tcPr>
-          <w:p>
-            <w:r/>
-            <w:r>
-              <w:rPr>
-                <w:rFonts w:ascii="Times New Roman" w:hAnsi="Times New Roman" w:eastAsia="Times New Roman"/>
-                <w:sz w:val="20"/>
-              </w:rPr>
-              <w:t>Catálogo completo con imágenes y stock inicial</w:t>
+            <w:tcW w:type="dxa" w:w="2608"/>
+          </w:tcPr>
+          <w:p>
+            <w:r/>
+            <w:r>
+              <w:rPr>
+                <w:rFonts w:ascii="Times New Roman" w:hAnsi="Times New Roman" w:eastAsia="Times New Roman"/>
+                <w:sz w:val="20"/>
+              </w:rPr>
+              <w:t>Completitud del catálogo y contactos</w:t>
+            </w:r>
+          </w:p>
+        </w:tc>
+        <w:tc>
+          <w:tcPr>
+            <w:tcW w:type="dxa" w:w="4309"/>
+          </w:tcPr>
+          <w:p>
+            <w:r/>
+            <w:r>
+              <w:rPr>
+                <w:rFonts w:ascii="Times New Roman" w:hAnsi="Times New Roman" w:eastAsia="Times New Roman"/>
+                <w:sz w:val="20"/>
+              </w:rPr>
+              <w:t>30 de 30 productos con costo, precio, imagen y stock; 6 proveedores y 7 clientes</w:t>
             </w:r>
           </w:p>
         </w:tc>
@@ -865,52 +842,37 @@
                 <w:rFonts w:ascii="Times New Roman" w:hAnsi="Times New Roman" w:eastAsia="Times New Roman"/>
                 <w:sz w:val="20"/>
               </w:rPr>
-              <w:t>Compras y abastecimiento</w:t>
-            </w:r>
-          </w:p>
-        </w:tc>
-        <w:tc>
-          <w:tcPr>
-            <w:tcW w:type="dxa" w:w="1587"/>
-          </w:tcPr>
-          <w:p>
-            <w:r/>
-            <w:r>
-              <w:rPr>
-                <w:rFonts w:ascii="Times New Roman" w:hAnsi="Times New Roman" w:eastAsia="Times New Roman"/>
-                <w:sz w:val="20"/>
-              </w:rPr>
-              <w:t>Javier Pérez</w:t>
-            </w:r>
-          </w:p>
-        </w:tc>
-        <w:tc>
-          <w:tcPr>
-            <w:tcW w:type="dxa" w:w="3061"/>
-          </w:tcPr>
-          <w:p>
-            <w:r/>
-            <w:r>
-              <w:rPr>
-                <w:rFonts w:ascii="Times New Roman" w:hAnsi="Times New Roman" w:eastAsia="Times New Roman"/>
-                <w:sz w:val="20"/>
-              </w:rPr>
-              <w:t>3 órdenes de compra (Q 17,090.00), 2 recepciones, 1 orden pendiente (P00027)</w:t>
-            </w:r>
-          </w:p>
-        </w:tc>
-        <w:tc>
-          <w:tcPr>
-            <w:tcW w:type="dxa" w:w="2268"/>
-          </w:tcPr>
-          <w:p>
-            <w:r/>
-            <w:r>
-              <w:rPr>
-                <w:rFonts w:ascii="Times New Roman" w:hAnsi="Times New Roman" w:eastAsia="Times New Roman"/>
-                <w:sz w:val="20"/>
-              </w:rPr>
-              <w:t>+44 unidades en bodega, actualización automática</w:t>
+              <w:t>Compras</w:t>
+            </w:r>
+          </w:p>
+        </w:tc>
+        <w:tc>
+          <w:tcPr>
+            <w:tcW w:type="dxa" w:w="2608"/>
+          </w:tcPr>
+          <w:p>
+            <w:r/>
+            <w:r>
+              <w:rPr>
+                <w:rFonts w:ascii="Times New Roman" w:hAnsi="Times New Roman" w:eastAsia="Times New Roman"/>
+                <w:sz w:val="20"/>
+              </w:rPr>
+              <w:t>Ciclos completos y exactitud de recepción</w:t>
+            </w:r>
+          </w:p>
+        </w:tc>
+        <w:tc>
+          <w:tcPr>
+            <w:tcW w:type="dxa" w:w="4309"/>
+          </w:tcPr>
+          <w:p>
+            <w:r/>
+            <w:r>
+              <w:rPr>
+                <w:rFonts w:ascii="Times New Roman" w:hAnsi="Times New Roman" w:eastAsia="Times New Roman"/>
+                <w:sz w:val="20"/>
+              </w:rPr>
+              <w:t>2 de 2 ciclos completos; 44 unidades recibidas de 44 pedidas (100 %); 1 orden pendiente (P00027)</w:t>
             </w:r>
           </w:p>
         </w:tc>
@@ -933,46 +895,31 @@
         </w:tc>
         <w:tc>
           <w:tcPr>
-            <w:tcW w:type="dxa" w:w="1587"/>
-          </w:tcPr>
-          <w:p>
-            <w:r/>
-            <w:r>
-              <w:rPr>
-                <w:rFonts w:ascii="Times New Roman" w:hAnsi="Times New Roman" w:eastAsia="Times New Roman"/>
-                <w:sz w:val="20"/>
-              </w:rPr>
-              <w:t>Eduardo López</w:t>
-            </w:r>
-          </w:p>
-        </w:tc>
-        <w:tc>
-          <w:tcPr>
-            <w:tcW w:type="dxa" w:w="3061"/>
-          </w:tcPr>
-          <w:p>
-            <w:r/>
-            <w:r>
-              <w:rPr>
-                <w:rFonts w:ascii="Times New Roman" w:hAnsi="Times New Roman" w:eastAsia="Times New Roman"/>
-                <w:sz w:val="20"/>
-              </w:rPr>
-              <w:t>2 pedidos de venta (Q 10,540.00), 1 entrega, 1 factura (Q 920.00)</w:t>
-            </w:r>
-          </w:p>
-        </w:tc>
-        <w:tc>
-          <w:tcPr>
-            <w:tcW w:type="dxa" w:w="2268"/>
-          </w:tcPr>
-          <w:p>
-            <w:r/>
-            <w:r>
-              <w:rPr>
-                <w:rFonts w:ascii="Times New Roman" w:hAnsi="Times New Roman" w:eastAsia="Times New Roman"/>
-                <w:sz w:val="20"/>
-              </w:rPr>
-              <w:t>Reserva y salida de stock automáticas</w:t>
+            <w:tcW w:type="dxa" w:w="2608"/>
+          </w:tcPr>
+          <w:p>
+            <w:r/>
+            <w:r>
+              <w:rPr>
+                <w:rFonts w:ascii="Times New Roman" w:hAnsi="Times New Roman" w:eastAsia="Times New Roman"/>
+                <w:sz w:val="20"/>
+              </w:rPr>
+              <w:t>Conversión y facturación</w:t>
+            </w:r>
+          </w:p>
+        </w:tc>
+        <w:tc>
+          <w:tcPr>
+            <w:tcW w:type="dxa" w:w="4309"/>
+          </w:tcPr>
+          <w:p>
+            <w:r/>
+            <w:r>
+              <w:rPr>
+                <w:rFonts w:ascii="Times New Roman" w:hAnsi="Times New Roman" w:eastAsia="Times New Roman"/>
+                <w:sz w:val="20"/>
+              </w:rPr>
+              <w:t>2 de 2 cotizaciones convertidas (Q 10,540.00); 1 entrega y 1 factura publicada (Q 920.00)</w:t>
             </w:r>
           </w:p>
         </w:tc>
@@ -995,46 +942,125 @@
         </w:tc>
         <w:tc>
           <w:tcPr>
-            <w:tcW w:type="dxa" w:w="1587"/>
-          </w:tcPr>
-          <w:p>
-            <w:r/>
-            <w:r>
-              <w:rPr>
-                <w:rFonts w:ascii="Times New Roman" w:hAnsi="Times New Roman" w:eastAsia="Times New Roman"/>
-                <w:sz w:val="20"/>
-              </w:rPr>
-              <w:t>Eduardo López</w:t>
-            </w:r>
-          </w:p>
-        </w:tc>
-        <w:tc>
-          <w:tcPr>
-            <w:tcW w:type="dxa" w:w="3061"/>
-          </w:tcPr>
-          <w:p>
-            <w:r/>
-            <w:r>
-              <w:rPr>
-                <w:rFonts w:ascii="Times New Roman" w:hAnsi="Times New Roman" w:eastAsia="Times New Roman"/>
-                <w:sz w:val="20"/>
-              </w:rPr>
-              <w:t>1 alerta de stock bajo (RA-014), 1 orden de reposición (P00028)</w:t>
-            </w:r>
-          </w:p>
-        </w:tc>
-        <w:tc>
-          <w:tcPr>
-            <w:tcW w:type="dxa" w:w="2268"/>
-          </w:tcPr>
-          <w:p>
-            <w:r/>
-            <w:r>
-              <w:rPr>
-                <w:rFonts w:ascii="Times New Roman" w:hAnsi="Times New Roman" w:eastAsia="Times New Roman"/>
-                <w:sz w:val="20"/>
-              </w:rPr>
-              <w:t>Prevención de quiebre de stock</w:t>
+            <w:tcW w:type="dxa" w:w="2608"/>
+          </w:tcPr>
+          <w:p>
+            <w:r/>
+            <w:r>
+              <w:rPr>
+                <w:rFonts w:ascii="Times New Roman" w:hAnsi="Times New Roman" w:eastAsia="Times New Roman"/>
+                <w:sz w:val="20"/>
+              </w:rPr>
+              <w:t>Alertas de stock bajo atendidas</w:t>
+            </w:r>
+          </w:p>
+        </w:tc>
+        <w:tc>
+          <w:tcPr>
+            <w:tcW w:type="dxa" w:w="4309"/>
+          </w:tcPr>
+          <w:p>
+            <w:r/>
+            <w:r>
+              <w:rPr>
+                <w:rFonts w:ascii="Times New Roman" w:hAnsi="Times New Roman" w:eastAsia="Times New Roman"/>
+                <w:sz w:val="20"/>
+              </w:rPr>
+              <w:t>1 de 1 alerta (RA-014) convertida en la orden de reposición P00028</w:t>
+            </w:r>
+          </w:p>
+        </w:tc>
+      </w:tr>
+      <w:tr>
+        <w:tc>
+          <w:tcPr>
+            <w:tcW w:type="dxa" w:w="1928"/>
+          </w:tcPr>
+          <w:p>
+            <w:r/>
+            <w:r>
+              <w:rPr>
+                <w:rFonts w:ascii="Times New Roman" w:hAnsi="Times New Roman" w:eastAsia="Times New Roman"/>
+                <w:sz w:val="20"/>
+              </w:rPr>
+              <w:t>CRM</w:t>
+            </w:r>
+          </w:p>
+        </w:tc>
+        <w:tc>
+          <w:tcPr>
+            <w:tcW w:type="dxa" w:w="2608"/>
+          </w:tcPr>
+          <w:p>
+            <w:r/>
+            <w:r>
+              <w:rPr>
+                <w:rFonts w:ascii="Times New Roman" w:hAnsi="Times New Roman" w:eastAsia="Times New Roman"/>
+                <w:sz w:val="20"/>
+              </w:rPr>
+              <w:t>Avance del pipeline</w:t>
+            </w:r>
+          </w:p>
+        </w:tc>
+        <w:tc>
+          <w:tcPr>
+            <w:tcW w:type="dxa" w:w="4309"/>
+          </w:tcPr>
+          <w:p>
+            <w:r/>
+            <w:r>
+              <w:rPr>
+                <w:rFonts w:ascii="Times New Roman" w:hAnsi="Times New Roman" w:eastAsia="Times New Roman"/>
+                <w:sz w:val="20"/>
+              </w:rPr>
+              <w:t>5 oportunidades registradas; 1 ganada (Q 18,500.00, 27 % del monto esperado)</w:t>
+            </w:r>
+          </w:p>
+        </w:tc>
+      </w:tr>
+      <w:tr>
+        <w:tc>
+          <w:tcPr>
+            <w:tcW w:type="dxa" w:w="1928"/>
+          </w:tcPr>
+          <w:p>
+            <w:r/>
+            <w:r>
+              <w:rPr>
+                <w:rFonts w:ascii="Times New Roman" w:hAnsi="Times New Roman" w:eastAsia="Times New Roman"/>
+                <w:sz w:val="20"/>
+              </w:rPr>
+              <w:t>Campañas de correo</w:t>
+            </w:r>
+          </w:p>
+        </w:tc>
+        <w:tc>
+          <w:tcPr>
+            <w:tcW w:type="dxa" w:w="2608"/>
+          </w:tcPr>
+          <w:p>
+            <w:r/>
+            <w:r>
+              <w:rPr>
+                <w:rFonts w:ascii="Times New Roman" w:hAnsi="Times New Roman" w:eastAsia="Times New Roman"/>
+                <w:sz w:val="20"/>
+              </w:rPr>
+              <w:t>Tasa de entrega</w:t>
+            </w:r>
+          </w:p>
+        </w:tc>
+        <w:tc>
+          <w:tcPr>
+            <w:tcW w:type="dxa" w:w="4309"/>
+          </w:tcPr>
+          <w:p>
+            <w:r/>
+            <w:r>
+              <w:rPr>
+                <w:rFonts w:ascii="Times New Roman" w:hAnsi="Times New Roman" w:eastAsia="Times New Roman"/>
+                <w:sz w:val="20"/>
+              </w:rPr>
+              <w:t>7 de 7 correos entregados (100 %): 4 al segmento Corporativo y 3 a Consumidor Individual</w:t>
             </w:r>
           </w:p>
         </w:tc>
@@ -1057,7 +1083,7 @@
           <w:rFonts w:ascii="Times New Roman" w:hAnsi="Times New Roman" w:eastAsia="Times New Roman"/>
           <w:sz w:val="24"/>
         </w:rPr>
-        <w:t>Los procesos de la Fase 2 funcionan de extremo a extremo: lo comprado ingresa automáticamente al inventario, lo vendido se reserva y descuenta en el momento del despacho, y las alertas de reposición se convierten en órdenes de compra. Tres de los cinco KPIs ya cumplen su meta; los dos restantes (conversión de la tienda en línea y CSAT) requieren el sitio web y las encuestas del CRM, previstos para la Fase 3.</w:t>
+        <w:t>Los procesos de la Fase 2 funcionan de extremo a extremo: lo comprado ingresa automáticamente al inventario, lo vendido se reserva y descuenta en el momento del despacho, las alertas de reposición se convierten en órdenes de compra, y el CRM permite dar seguimiento a las oportunidades y llegar a cada segmento de clientes con campañas de correo. Tres de los cinco KPIs ya cumplen su meta; los dos restantes (conversión de la tienda en línea y CSAT) requieren el sitio web y las encuestas del CRM, previstos para la Fase 3.</w:t>
       </w:r>
     </w:p>
     <w:sectPr>

</xml_diff>